<commit_message>
Stap 2 van het licentieplan: de waardeset lag al vast
Het manuscript legt de Belgische waardeset al vast voor de QALY-berekening. De
stap vroeg om die keuze nog te maken; hij hoeft alleen bevestigd te worden en in
het analyseplan vastgelegd. Dat versterkt ook de vraag aan EuroQol: bij een
Belgische waardeset hoort een Belgische vragenlijstversie.

Co-Authored-By: Claude Opus 5 <noreply@anthropic.com>
</commit_message>
<xml_diff>
--- a/PARADISE_licenties_vragenlijsten.docx
+++ b/PARADISE_licenties_vragenlijsten.docx
@@ -898,7 +898,7 @@
           <w:color w:val="1B2630"/>
           <w:sz w:val="18"/>
         </w:rPr>
-        <w:t xml:space="preserve">De waardeset apart beslissen.  </w:t>
+        <w:t xml:space="preserve">De waardeset: al beslist, alleen bevestigen.  </w:t>
       </w:r>
       <w:r>
         <w:rPr>
@@ -906,7 +906,7 @@
           <w:color w:val="5A6A78"/>
           <w:sz w:val="18"/>
         </w:rPr>
-        <w:t>Welke waardeset je gebruikt om utiliteiten en QALY’s te berekenen is een analysekeuze, geen eigenschap van de vragenlijst. Met Maaike Fobelets en Koen Putman, en vastleggen in het analyseplan van oktober.</w:t>
+        <w:t>Het manuscript legt de Belgische waardeset al vast voor de QALY-berekening. Dat hoeft dus niet opnieuw beslist te worden; laat Maaike Fobelets en Koen Putman wel bevestigen welke set precies, en leg de verwijzing vast in het analyseplan van oktober. Het versterkt meteen de vraag aan EuroQol: met een Belgische waardeset hoort een Belgische vragenlijstversie.</w:t>
       </w:r>
     </w:p>
     <w:p>

</xml_diff>